<commit_message>
fix(leave-form): manager signature under Line Manager, drop printed name
On the Leave Application Form (GSSG-HR 300-003, annual + sick leave) the
manager signature sat under a "Dept. Head Signature" label while the
"Line Manager" slot printed the manager's name. Move {{ manager_sig }} into
the Line Manager cell (where the name was), blank the old Dept. Head slot,
and remove {{ manager_name }} — leaving employee signature + manager
signature only, no printed name.

Co-Authored-By: Claude Opus 4.8 (1M context) <noreply@anthropic.com>
Claude-Session: https://claude.ai/code/session_01JyBSNP79E1EuVCDYGUVHBi
</commit_message>
<xml_diff>
--- a/backend/templates/GSSG-HR_300-003_Leave_Application_Form.docx
+++ b/backend/templates/GSSG-HR_300-003_Leave_Application_Form.docx
@@ -4405,7 +4405,7 @@
                 <w:b/>
                 <w:sz w:val="18"/>
               </w:rPr>
-              <w:t>Dept.</w:t>
+              <w:t/>
             </w:r>
             <w:r>
               <w:rPr>
@@ -4413,14 +4413,14 @@
                 <w:spacing w:val="-8"/>
                 <w:sz w:val="18"/>
               </w:rPr>
-              <w:t xml:space="preserve"> </w:t>
-            </w:r>
-            <w:r>
-              <w:rPr>
-                <w:b/>
-                <w:sz w:val="18"/>
-              </w:rPr>
-              <w:t xml:space="preserve">Head </w:t>
+              <w:t xml:space="preserve"/>
+            </w:r>
+            <w:r>
+              <w:rPr>
+                <w:b/>
+                <w:sz w:val="18"/>
+              </w:rPr>
+              <w:t xml:space="preserve"/>
             </w:r>
             <w:r>
               <w:rPr>
@@ -4428,7 +4428,7 @@
                 <w:spacing w:val="-2"/>
                 <w:sz w:val="18"/>
               </w:rPr>
-              <w:t>Signature</w:t>
+              <w:t/>
             </w:r>
           </w:p>
         </w:tc>
@@ -4452,7 +4452,7 @@
                 <w:rFonts w:ascii="Times New Roman"/>
                 <w:sz w:val="16"/>
               </w:rPr>
-              <w:t>{{ manager_sig }}</w:t>
+              <w:t/>
             </w:r>
           </w:p>
         </w:tc>
@@ -4512,7 +4512,7 @@
                 <w:rFonts w:ascii="Times New Roman"/>
                 <w:sz w:val="16"/>
               </w:rPr>
-              <w:t>{{ manager_name }}</w:t>
+              <w:t>{{ manager_sig }}</w:t>
             </w:r>
           </w:p>
         </w:tc>

</xml_diff>